<commit_message>
docs(manual): capitulo 0 de usuario con paso a paso para PC, iOS y Android
</commit_message>
<xml_diff>
--- a/docs/manual-usuario/word/00_Capitulo_Bienvenida_y_Mapa_del_Sistema.docx
+++ b/docs/manual-usuario/word/00_Capitulo_Bienvenida_y_Mapa_del_Sistema.docx
@@ -72,7 +72,7 @@
           </w:tcPr>
           <w:p>
             <w:pPr>
-              <w:spacing w:after="60" w:before="80"/>
+              <w:spacing w:after="60" w:before="100"/>
             </w:pPr>
             <w:r>
               <w:rPr>
@@ -87,7 +87,7 @@
           </w:p>
           <w:p>
             <w:pPr>
-              <w:spacing w:after="80"/>
+              <w:spacing w:after="100"/>
             </w:pPr>
             <w:r>
               <w:rPr>
@@ -103,7 +103,7 @@
     </w:tbl>
     <w:p>
       <w:pPr>
-        <w:spacing w:after="120"/>
+        <w:spacing w:after="140"/>
       </w:pPr>
     </w:p>
     <w:p>
@@ -116,49 +116,121 @@
       </w:r>
     </w:p>
     <w:p>
-      <w:r>
-        <w:rPr>
-          <w:b/>
-          <w:bCs/>
-        </w:rPr>
-        <w:t xml:space="preserve">• Cobras en 3 segundos: </w:t>
-      </w:r>
-      <w:r>
-        <w:t xml:space="preserve">Escaneas con la cámara de tu celular o buscas por nombre, y el cobro queda registrado al instante.
-</w:t>
-      </w:r>
-      <w:r>
-        <w:rPr>
-          <w:b/>
-          <w:bCs/>
-        </w:rPr>
-        <w:t xml:space="preserve">• Cuentas 100% claras: </w:t>
-      </w:r>
-      <w:r>
-        <w:t xml:space="preserve">Sabes exactamente cuánto dinero entró en efectivo, cuánto por transferencias (Nequi/Daviplata) y cuánto te deben los clientes de fiado.
-</w:t>
-      </w:r>
-      <w:r>
-        <w:rPr>
-          <w:b/>
-          <w:bCs/>
-        </w:rPr>
-        <w:t xml:space="preserve">• Cero discusiones con clientes: </w:t>
-      </w:r>
-      <w:r>
-        <w:t xml:space="preserve">Cada venta, crédito o abono genera un recibo digital formal que se envía directo a su WhatsApp con un solo toque.
-</w:t>
-      </w:r>
-      <w:r>
-        <w:rPr>
-          <w:b/>
-          <w:bCs/>
-        </w:rPr>
-        <w:t xml:space="preserve">• Control total estés donde estés: </w:t>
-      </w:r>
-      <w:r>
+      <w:pPr>
+        <w:spacing w:after="80" w:before="40" w:line="260"/>
+        <w:ind w:left="360" w:hanging="240"/>
+      </w:pPr>
+      <w:r>
+        <w:rPr>
+          <w:b/>
+          <w:bCs/>
+          <w:color w:val="059669"/>
+        </w:rPr>
+        <w:t xml:space="preserve">•  </w:t>
+      </w:r>
+      <w:r>
+        <w:rPr>
+          <w:b/>
+          <w:bCs/>
+          <w:color w:val="0F172A"/>
+        </w:rPr>
+        <w:t xml:space="preserve">Cobras en 3 segundos: </w:t>
+      </w:r>
+      <w:r>
+        <w:rPr>
+          <w:color w:val="334155"/>
+        </w:rPr>
+        <w:t xml:space="preserve">Escaneas con la cámara de tu celular o buscas por nombre, y el cobro queda registrado al instante.</w:t>
+      </w:r>
+    </w:p>
+    <w:p>
+      <w:pPr>
+        <w:spacing w:after="80" w:before="40" w:line="260"/>
+        <w:ind w:left="360" w:hanging="240"/>
+      </w:pPr>
+      <w:r>
+        <w:rPr>
+          <w:b/>
+          <w:bCs/>
+          <w:color w:val="059669"/>
+        </w:rPr>
+        <w:t xml:space="preserve">•  </w:t>
+      </w:r>
+      <w:r>
+        <w:rPr>
+          <w:b/>
+          <w:bCs/>
+          <w:color w:val="0F172A"/>
+        </w:rPr>
+        <w:t xml:space="preserve">Cuentas 100% claras: </w:t>
+      </w:r>
+      <w:r>
+        <w:rPr>
+          <w:color w:val="334155"/>
+        </w:rPr>
+        <w:t xml:space="preserve">Sabes exactamente cuánto dinero entró en efectivo, cuánto por transferencias (Nequi/Daviplata) y cuánto te deben los clientes de fiado.</w:t>
+      </w:r>
+    </w:p>
+    <w:p>
+      <w:pPr>
+        <w:spacing w:after="80" w:before="40" w:line="260"/>
+        <w:ind w:left="360" w:hanging="240"/>
+      </w:pPr>
+      <w:r>
+        <w:rPr>
+          <w:b/>
+          <w:bCs/>
+          <w:color w:val="059669"/>
+        </w:rPr>
+        <w:t xml:space="preserve">•  </w:t>
+      </w:r>
+      <w:r>
+        <w:rPr>
+          <w:b/>
+          <w:bCs/>
+          <w:color w:val="0F172A"/>
+        </w:rPr>
+        <w:t xml:space="preserve">Cero discusiones con clientes: </w:t>
+      </w:r>
+      <w:r>
+        <w:rPr>
+          <w:color w:val="334155"/>
+        </w:rPr>
+        <w:t xml:space="preserve">Cada venta, crédito o abono genera un recibo digital formal que se envía directo a su WhatsApp con un solo toque.</w:t>
+      </w:r>
+    </w:p>
+    <w:p>
+      <w:pPr>
+        <w:spacing w:after="80" w:before="40" w:line="260"/>
+        <w:ind w:left="360" w:hanging="240"/>
+      </w:pPr>
+      <w:r>
+        <w:rPr>
+          <w:b/>
+          <w:bCs/>
+          <w:color w:val="059669"/>
+        </w:rPr>
+        <w:t xml:space="preserve">•  </w:t>
+      </w:r>
+      <w:r>
+        <w:rPr>
+          <w:b/>
+          <w:bCs/>
+          <w:color w:val="0F172A"/>
+        </w:rPr>
+        <w:t xml:space="preserve">Control total estés donde estés: </w:t>
+      </w:r>
+      <w:r>
+        <w:rPr>
+          <w:color w:val="334155"/>
+        </w:rPr>
         <w:t xml:space="preserve">Si estás fuera del local o de viaje, abres Fiabono en tu celular y ves en vivo cada venta que tus empleados registran en mostrador.</w:t>
       </w:r>
+    </w:p>
+    <w:p>
+      <w:pPr>
+        <w:spacing w:after="120"/>
+      </w:pPr>
     </w:p>
     <w:p>
       <w:pPr>
@@ -170,31 +242,73 @@
       </w:r>
     </w:p>
     <w:p>
-      <w:r>
-        <w:t xml:space="preserve">Fiabono no ocupa espacio en la memoria de tu teléfono ni se desactualiza. Puedes dejarlo en tu pantalla de inicio en 2 pasos:
-</w:t>
-      </w:r>
-      <w:r>
-        <w:rPr>
-          <w:b/>
-          <w:bCs/>
-        </w:rPr>
-        <w:t xml:space="preserve">• En Teléfonos Android (Google Chrome): </w:t>
-      </w:r>
-      <w:r>
-        <w:t xml:space="preserve">Abre fiabono.com &gt; Toca los tres puntos (⋮) arriba a la derecha &gt; Toca 'Agregar a la pantalla principal' o 'Instalar App'.
-</w:t>
-      </w:r>
-      <w:r>
-        <w:rPr>
-          <w:b/>
-          <w:bCs/>
-        </w:rPr>
-        <w:t xml:space="preserve">• En Teléfonos iPhone (Safari): </w:t>
-      </w:r>
-      <w:r>
-        <w:t xml:space="preserve">Abre fiabono.com &gt; Toca el botón Compartir (cuadro con flecha arriba) &gt; Toca 'Agregar al inicio'.</w:t>
-      </w:r>
+      <w:pPr>
+        <w:spacing w:after="100"/>
+      </w:pPr>
+      <w:r>
+        <w:t xml:space="preserve">Fiabono no ocupa espacio en la memoria de tu teléfono ni se desactualiza. Puedes dejarlo en tu pantalla de inicio en pocos segundos:</w:t>
+      </w:r>
+    </w:p>
+    <w:p>
+      <w:pPr>
+        <w:spacing w:after="80" w:before="40" w:line="260"/>
+        <w:ind w:left="360" w:hanging="240"/>
+      </w:pPr>
+      <w:r>
+        <w:rPr>
+          <w:b/>
+          <w:bCs/>
+          <w:color w:val="059669"/>
+        </w:rPr>
+        <w:t xml:space="preserve">•  </w:t>
+      </w:r>
+      <w:r>
+        <w:rPr>
+          <w:b/>
+          <w:bCs/>
+          <w:color w:val="0F172A"/>
+        </w:rPr>
+        <w:t xml:space="preserve">En Teléfonos Android (Google Chrome): </w:t>
+      </w:r>
+      <w:r>
+        <w:rPr>
+          <w:color w:val="334155"/>
+        </w:rPr>
+        <w:t xml:space="preserve">Abre fiabono.com &gt; Toca los tres puntos (⋮) arriba a la derecha &gt; Toca 'Agregar a la pantalla principal' o 'Instalar App'.</w:t>
+      </w:r>
+    </w:p>
+    <w:p>
+      <w:pPr>
+        <w:spacing w:after="80" w:before="40" w:line="260"/>
+        <w:ind w:left="360" w:hanging="240"/>
+      </w:pPr>
+      <w:r>
+        <w:rPr>
+          <w:b/>
+          <w:bCs/>
+          <w:color w:val="059669"/>
+        </w:rPr>
+        <w:t xml:space="preserve">•  </w:t>
+      </w:r>
+      <w:r>
+        <w:rPr>
+          <w:b/>
+          <w:bCs/>
+          <w:color w:val="0F172A"/>
+        </w:rPr>
+        <w:t xml:space="preserve">En Teléfonos iPhone (Safari): </w:t>
+      </w:r>
+      <w:r>
+        <w:rPr>
+          <w:color w:val="334155"/>
+        </w:rPr>
+        <w:t xml:space="preserve">Abre fiabono.com &gt; Toca el botón Compartir (cuadro con flecha arriba ↑) &gt; Toca 'Agregar al inicio'.</w:t>
+      </w:r>
+    </w:p>
+    <w:p>
+      <w:pPr>
+        <w:spacing w:after="80"/>
+      </w:pPr>
     </w:p>
     <w:tbl>
       <w:tblPr>
@@ -224,7 +338,7 @@
           </w:tcPr>
           <w:p>
             <w:pPr>
-              <w:spacing w:after="60" w:before="80"/>
+              <w:spacing w:after="60" w:before="100"/>
             </w:pPr>
             <w:r>
               <w:rPr>
@@ -239,7 +353,7 @@
           </w:p>
           <w:p>
             <w:pPr>
-              <w:spacing w:after="80"/>
+              <w:spacing w:after="100"/>
             </w:pPr>
             <w:r>
               <w:rPr>
@@ -255,7 +369,7 @@
     </w:tbl>
     <w:p>
       <w:pPr>
-        <w:spacing w:after="120"/>
+        <w:spacing w:after="140"/>
       </w:pPr>
     </w:p>
     <w:p>
@@ -268,19 +382,22 @@
       </w:r>
     </w:p>
     <w:p>
+      <w:pPr>
+        <w:spacing w:after="100"/>
+      </w:pPr>
       <w:r>
         <w:t xml:space="preserve">La interfaz de Fiabono está diseñada para que puedas manejar todo el negocio con una sola mano desde tu celular:</w:t>
       </w:r>
     </w:p>
     <w:p>
       <w:pPr>
-        <w:spacing w:after="60" w:before="100"/>
+        <w:spacing w:after="40" w:before="80"/>
         <w:jc w:val="center"/>
       </w:pPr>
       <w:r>
         <w:drawing>
           <wp:inline distT="0" distB="0" distL="0" distR="0">
-            <wp:extent cx="3238500" cy="4000500"/>
+            <wp:extent cx="3048000" cy="3810000"/>
             <wp:effectExtent t="0" r="0" b="0" l="0"/>
             <wp:docPr id="1" name=""/>
             <wp:cNvGraphicFramePr>
@@ -305,7 +422,7 @@
                   <pic:spPr bwMode="auto">
                     <a:xfrm>
                       <a:off x="0" y="0"/>
-                      <a:ext cx="3238500" cy="4000500"/>
+                      <a:ext cx="3048000" cy="3810000"/>
                     </a:xfrm>
                     <a:prstGeom prst="rect">
                       <a:avLst/>
@@ -320,7 +437,7 @@
     </w:p>
     <w:p>
       <w:pPr>
-        <w:spacing w:after="180"/>
+        <w:spacing w:after="160"/>
         <w:jc w:val="center"/>
       </w:pPr>
       <w:r>
@@ -335,78 +452,174 @@
       </w:r>
     </w:p>
     <w:p>
-      <w:r>
-        <w:rPr>
-          <w:b/>
-          <w:bCs/>
-        </w:rPr>
-        <w:t xml:space="preserve">El Menú Inferior (Dock Flotante Táctil):
-</w:t>
-      </w:r>
-      <w:r>
-        <w:rPr>
-          <w:b/>
-          <w:bCs/>
-        </w:rPr>
-        <w:t xml:space="preserve">🏠 Inicio: </w:t>
-      </w:r>
-      <w:r>
-        <w:t xml:space="preserve">Resumen del día, ventas totales, dinero en caja y buscador de clientes.
-</w:t>
-      </w:r>
-      <w:r>
-        <w:rPr>
-          <w:b/>
-          <w:bCs/>
-        </w:rPr>
-        <w:t xml:space="preserve">📦 Inventario: </w:t>
-      </w:r>
-      <w:r>
-        <w:t xml:space="preserve">Catálogo completo, precios, stock disponible e impresión de etiquetas con código de barras o QR.
-</w:t>
-      </w:r>
-      <w:r>
-        <w:rPr>
-          <w:b/>
-          <w:bCs/>
-        </w:rPr>
-        <w:t xml:space="preserve">🛒 Vender: </w:t>
-      </w:r>
-      <w:r>
-        <w:t xml:space="preserve">Tu caja registradora de mostrador para ventas rápidas de contado.
-</w:t>
-      </w:r>
-      <w:r>
-        <w:rPr>
-          <w:b/>
-          <w:bCs/>
-        </w:rPr>
-        <w:t xml:space="preserve">🔖 Separes: </w:t>
-      </w:r>
-      <w:r>
-        <w:t xml:space="preserve">Control de apartados de mercancía con fotos de la prenda y fecha límite de entrega.
-</w:t>
-      </w:r>
-      <w:r>
-        <w:rPr>
-          <w:b/>
-          <w:bCs/>
-        </w:rPr>
-        <w:t xml:space="preserve">🕒 Historial: </w:t>
-      </w:r>
-      <w:r>
+      <w:pPr>
+        <w:spacing w:after="100" w:before="80"/>
+      </w:pPr>
+      <w:r>
+        <w:rPr>
+          <w:b/>
+          <w:bCs/>
+          <w:color w:val="0F172A"/>
+          <w:sz w:val="24"/>
+          <w:szCs w:val="24"/>
+        </w:rPr>
+        <w:t xml:space="preserve">El Menú Inferior (Dock Flotante Táctil):</w:t>
+      </w:r>
+    </w:p>
+    <w:p>
+      <w:pPr>
+        <w:spacing w:after="80" w:before="40" w:line="260"/>
+        <w:ind w:left="360" w:hanging="240"/>
+      </w:pPr>
+      <w:r>
+        <w:rPr>
+          <w:b/>
+          <w:bCs/>
+          <w:color w:val="059669"/>
+        </w:rPr>
+        <w:t xml:space="preserve">🏠  </w:t>
+      </w:r>
+      <w:r>
+        <w:rPr>
+          <w:b/>
+          <w:bCs/>
+          <w:color w:val="0F172A"/>
+        </w:rPr>
+        <w:t xml:space="preserve">Inicio: </w:t>
+      </w:r>
+      <w:r>
+        <w:rPr>
+          <w:color w:val="334155"/>
+        </w:rPr>
+        <w:t xml:space="preserve">Resumen del día, ventas totales, dinero en caja y buscador rápido de clientes.</w:t>
+      </w:r>
+    </w:p>
+    <w:p>
+      <w:pPr>
+        <w:spacing w:after="80" w:before="40" w:line="260"/>
+        <w:ind w:left="360" w:hanging="240"/>
+      </w:pPr>
+      <w:r>
+        <w:rPr>
+          <w:b/>
+          <w:bCs/>
+          <w:color w:val="059669"/>
+        </w:rPr>
+        <w:t xml:space="preserve">📦  </w:t>
+      </w:r>
+      <w:r>
+        <w:rPr>
+          <w:b/>
+          <w:bCs/>
+          <w:color w:val="0F172A"/>
+        </w:rPr>
+        <w:t xml:space="preserve">Inventario: </w:t>
+      </w:r>
+      <w:r>
+        <w:rPr>
+          <w:color w:val="334155"/>
+        </w:rPr>
+        <w:t xml:space="preserve">Catálogo completo, precios, stock disponible e impresión de etiquetas con código de barras o QR.</w:t>
+      </w:r>
+    </w:p>
+    <w:p>
+      <w:pPr>
+        <w:spacing w:after="80" w:before="40" w:line="260"/>
+        <w:ind w:left="360" w:hanging="240"/>
+      </w:pPr>
+      <w:r>
+        <w:rPr>
+          <w:b/>
+          <w:bCs/>
+          <w:color w:val="059669"/>
+        </w:rPr>
+        <w:t xml:space="preserve">🛒  </w:t>
+      </w:r>
+      <w:r>
+        <w:rPr>
+          <w:b/>
+          <w:bCs/>
+          <w:color w:val="0F172A"/>
+        </w:rPr>
+        <w:t xml:space="preserve">Vender: </w:t>
+      </w:r>
+      <w:r>
+        <w:rPr>
+          <w:color w:val="334155"/>
+        </w:rPr>
+        <w:t xml:space="preserve">Tu caja registradora de mostrador para ventas rápidas de contado.</w:t>
+      </w:r>
+    </w:p>
+    <w:p>
+      <w:pPr>
+        <w:spacing w:after="80" w:before="40" w:line="260"/>
+        <w:ind w:left="360" w:hanging="240"/>
+      </w:pPr>
+      <w:r>
+        <w:rPr>
+          <w:b/>
+          <w:bCs/>
+          <w:color w:val="059669"/>
+        </w:rPr>
+        <w:t xml:space="preserve">🔖  </w:t>
+      </w:r>
+      <w:r>
+        <w:rPr>
+          <w:b/>
+          <w:bCs/>
+          <w:color w:val="0F172A"/>
+        </w:rPr>
+        <w:t xml:space="preserve">Separes: </w:t>
+      </w:r>
+      <w:r>
+        <w:rPr>
+          <w:color w:val="334155"/>
+        </w:rPr>
+        <w:t xml:space="preserve">Control de apartados de mercancía con fotos de la prenda y fecha límite de entrega.</w:t>
+      </w:r>
+    </w:p>
+    <w:p>
+      <w:pPr>
+        <w:spacing w:after="80" w:before="40" w:line="260"/>
+        <w:ind w:left="360" w:hanging="240"/>
+      </w:pPr>
+      <w:r>
+        <w:rPr>
+          <w:b/>
+          <w:bCs/>
+          <w:color w:val="059669"/>
+        </w:rPr>
+        <w:t xml:space="preserve">🕒  </w:t>
+      </w:r>
+      <w:r>
+        <w:rPr>
+          <w:b/>
+          <w:bCs/>
+          <w:color w:val="0F172A"/>
+        </w:rPr>
+        <w:t xml:space="preserve">Historial: </w:t>
+      </w:r>
+      <w:r>
+        <w:rPr>
+          <w:color w:val="334155"/>
+        </w:rPr>
         <w:t xml:space="preserve">Registro transparente de cada venta, fiado o abono realizado en el local.</w:t>
       </w:r>
     </w:p>
     <w:p>
       <w:pPr>
-        <w:spacing w:after="60" w:before="120"/>
+        <w:spacing w:after="140"/>
+      </w:pPr>
+    </w:p>
+    <w:p>
+      <w:pPr>
+        <w:spacing w:after="40" w:before="100"/>
         <w:jc w:val="center"/>
       </w:pPr>
       <w:r>
         <w:drawing>
           <wp:inline distT="0" distB="0" distL="0" distR="0">
-            <wp:extent cx="4762500" cy="2476500"/>
+            <wp:extent cx="4572000" cy="2381250"/>
             <wp:effectExtent t="0" r="0" b="0" l="0"/>
             <wp:docPr id="2" name=""/>
             <wp:cNvGraphicFramePr>
@@ -431,7 +644,7 @@
                   <pic:spPr bwMode="auto">
                     <a:xfrm>
                       <a:off x="0" y="0"/>
-                      <a:ext cx="4762500" cy="2476500"/>
+                      <a:ext cx="4572000" cy="2381250"/>
                     </a:xfrm>
                     <a:prstGeom prst="rect">
                       <a:avLst/>
@@ -446,7 +659,7 @@
     </w:p>
     <w:p>
       <w:pPr>
-        <w:spacing w:after="180"/>
+        <w:spacing w:after="160"/>
         <w:jc w:val="center"/>
       </w:pPr>
       <w:r>
@@ -470,6 +683,9 @@
       </w:r>
     </w:p>
     <w:p>
+      <w:pPr>
+        <w:spacing w:after="100"/>
+      </w:pPr>
       <w:r>
         <w:t xml:space="preserve">En Fiabono, la privacidad de tus finanzas es sagrada. Tus empleados solo pueden ver y operar lo que tú expresamente les autorices:</w:t>
       </w:r>
@@ -1099,7 +1315,7 @@
           </w:tcPr>
           <w:p>
             <w:pPr>
-              <w:spacing w:after="60" w:before="80"/>
+              <w:spacing w:after="60" w:before="100"/>
             </w:pPr>
             <w:r>
               <w:rPr>
@@ -1114,7 +1330,7 @@
           </w:p>
           <w:p>
             <w:pPr>
-              <w:spacing w:after="80"/>
+              <w:spacing w:after="100"/>
             </w:pPr>
             <w:r>
               <w:rPr>
@@ -1143,60 +1359,149 @@
       </w:r>
     </w:p>
     <w:p>
-      <w:r>
-        <w:rPr>
-          <w:b/>
-          <w:bCs/>
+      <w:pPr>
+        <w:spacing w:after="80" w:before="40" w:line="260"/>
+        <w:ind w:left="360" w:hanging="240"/>
+      </w:pPr>
+      <w:r>
+        <w:rPr>
+          <w:b/>
+          <w:bCs/>
+          <w:color w:val="059669"/>
+        </w:rPr>
+        <w:t xml:space="preserve">💵  </w:t>
+      </w:r>
+      <w:r>
+        <w:rPr>
+          <w:b/>
+          <w:bCs/>
+          <w:color w:val="0F172A"/>
         </w:rPr>
         <w:t xml:space="preserve">1. Venta de Contado: </w:t>
       </w:r>
       <w:r>
-        <w:t xml:space="preserve">El cliente paga el 100% de la mercancía en el momento (efectivo, Nequi, tarjeta) y se lleva el producto.
-</w:t>
-      </w:r>
-      <w:r>
-        <w:rPr>
-          <w:b/>
-          <w:bCs/>
+        <w:rPr>
+          <w:color w:val="334155"/>
+        </w:rPr>
+        <w:t xml:space="preserve">El cliente paga el 100% de la mercancía en el momento (efectivo, Nequi, tarjeta) y se lleva el producto de inmediato.</w:t>
+      </w:r>
+    </w:p>
+    <w:p>
+      <w:pPr>
+        <w:spacing w:after="80" w:before="40" w:line="260"/>
+        <w:ind w:left="360" w:hanging="240"/>
+      </w:pPr>
+      <w:r>
+        <w:rPr>
+          <w:b/>
+          <w:bCs/>
+          <w:color w:val="059669"/>
+        </w:rPr>
+        <w:t xml:space="preserve">🏷️  </w:t>
+      </w:r>
+      <w:r>
+        <w:rPr>
+          <w:b/>
+          <w:bCs/>
+          <w:color w:val="0F172A"/>
         </w:rPr>
         <w:t xml:space="preserve">2. Fiado (Crédito de Confianza): </w:t>
       </w:r>
       <w:r>
-        <w:t xml:space="preserve">El cliente se lleva los productos hoy y te los paga después. El sistema le abre una cuenta digital y te avisa cuando entre en mora.
-</w:t>
-      </w:r>
-      <w:r>
-        <w:rPr>
-          <w:b/>
-          <w:bCs/>
+        <w:rPr>
+          <w:color w:val="334155"/>
+        </w:rPr>
+        <w:t xml:space="preserve">El cliente se lleva los productos hoy y te los paga después. El sistema le abre una cuenta digital y te avisa cuando entre en mora.</w:t>
+      </w:r>
+    </w:p>
+    <w:p>
+      <w:pPr>
+        <w:spacing w:after="80" w:before="40" w:line="260"/>
+        <w:ind w:left="360" w:hanging="240"/>
+      </w:pPr>
+      <w:r>
+        <w:rPr>
+          <w:b/>
+          <w:bCs/>
+          <w:color w:val="059669"/>
+        </w:rPr>
+        <w:t xml:space="preserve">🔖  </w:t>
+      </w:r>
+      <w:r>
+        <w:rPr>
+          <w:b/>
+          <w:bCs/>
+          <w:color w:val="0F172A"/>
         </w:rPr>
         <w:t xml:space="preserve">3. Plan Separe (Apartado): </w:t>
       </w:r>
       <w:r>
-        <w:t xml:space="preserve">El cliente aparta una prenda con un anticipo. La mercancía se queda guardada en tu tienda y el sistema bloquea el stock para que nadie más la venda hasta que termine de pagar.
-</w:t>
-      </w:r>
-      <w:r>
-        <w:rPr>
-          <w:b/>
-          <w:bCs/>
+        <w:rPr>
+          <w:color w:val="334155"/>
+        </w:rPr>
+        <w:t xml:space="preserve">El cliente aparta una prenda con un anticipo. La mercancía se queda guardada en tu tienda y el sistema bloquea el stock para que nadie más la venda hasta que termine de pagar.</w:t>
+      </w:r>
+    </w:p>
+    <w:p>
+      <w:pPr>
+        <w:spacing w:after="80" w:before="40" w:line="260"/>
+        <w:ind w:left="360" w:hanging="240"/>
+      </w:pPr>
+      <w:r>
+        <w:rPr>
+          <w:b/>
+          <w:bCs/>
+          <w:color w:val="059669"/>
+        </w:rPr>
+        <w:t xml:space="preserve">💳  </w:t>
+      </w:r>
+      <w:r>
+        <w:rPr>
+          <w:b/>
+          <w:bCs/>
+          <w:color w:val="0F172A"/>
         </w:rPr>
         <w:t xml:space="preserve">4. Abono: </w:t>
       </w:r>
       <w:r>
-        <w:t xml:space="preserve">Cualquier pago parcial que entrega un cliente para bajar su deuda de fiado o para completar su Plan Separe.
-</w:t>
-      </w:r>
-      <w:r>
-        <w:rPr>
-          <w:b/>
-          <w:bCs/>
+        <w:rPr>
+          <w:color w:val="334155"/>
+        </w:rPr>
+        <w:t xml:space="preserve">Cualquier pago parcial que entrega un cliente para bajar su deuda de fiado o para completar su Plan Separe.</w:t>
+      </w:r>
+    </w:p>
+    <w:p>
+      <w:pPr>
+        <w:spacing w:after="80" w:before="40" w:line="260"/>
+        <w:ind w:left="360" w:hanging="240"/>
+      </w:pPr>
+      <w:r>
+        <w:rPr>
+          <w:b/>
+          <w:bCs/>
+          <w:color w:val="059669"/>
+        </w:rPr>
+        <w:t xml:space="preserve">🔒  </w:t>
+      </w:r>
+      <w:r>
+        <w:rPr>
+          <w:b/>
+          <w:bCs/>
+          <w:color w:val="0F172A"/>
         </w:rPr>
         <w:t xml:space="preserve">5. Arqueo y Cierre de Caja: </w:t>
       </w:r>
       <w:r>
+        <w:rPr>
+          <w:color w:val="334155"/>
+        </w:rPr>
         <w:t xml:space="preserve">El conteo de billetes al terminar el día para confirmar que el dinero físico en tu cajón coincida con lo registrado en el sistema.</w:t>
       </w:r>
+    </w:p>
+    <w:p>
+      <w:pPr>
+        <w:spacing w:after="140"/>
+      </w:pPr>
     </w:p>
     <w:tbl>
       <w:tblPr>
@@ -1226,7 +1531,7 @@
           </w:tcPr>
           <w:p>
             <w:pPr>
-              <w:spacing w:after="60" w:before="80"/>
+              <w:spacing w:after="60" w:before="100"/>
             </w:pPr>
             <w:r>
               <w:rPr>
@@ -1241,7 +1546,7 @@
           </w:p>
           <w:p>
             <w:pPr>
-              <w:spacing w:after="80"/>
+              <w:spacing w:after="100"/>
             </w:pPr>
             <w:r>
               <w:rPr>
@@ -1270,84 +1575,198 @@
       </w:r>
     </w:p>
     <w:p>
-      <w:r>
-        <w:t xml:space="preserve">En los próximos capítulos de esta guía aprenderás paso a paso:
-</w:t>
-      </w:r>
-      <w:r>
-        <w:rPr>
-          <w:b/>
-          <w:bCs/>
-        </w:rPr>
-        <w:t xml:space="preserve">• Capítulo 1: </w:t>
-      </w:r>
-      <w:r>
-        <w:t xml:space="preserve">Cómo subir tu logo y configurar tus cuentas de Nequi y Daviplata.
-</w:t>
-      </w:r>
-      <w:r>
-        <w:rPr>
-          <w:b/>
-          <w:bCs/>
-        </w:rPr>
-        <w:t xml:space="preserve">• Capítulo 2: </w:t>
-      </w:r>
-      <w:r>
-        <w:t xml:space="preserve">Cómo abrir y cerrar tu caja todos los días sin descuadres.
-</w:t>
-      </w:r>
-      <w:r>
-        <w:rPr>
-          <w:b/>
-          <w:bCs/>
-        </w:rPr>
-        <w:t xml:space="preserve">• Capítulo 3: </w:t>
-      </w:r>
-      <w:r>
-        <w:t xml:space="preserve">Cómo ingresar productos e imprimir etiquetas térmicas con Código QR o de barras.
-</w:t>
-      </w:r>
-      <w:r>
-        <w:rPr>
-          <w:b/>
-          <w:bCs/>
-        </w:rPr>
-        <w:t xml:space="preserve">• Capítulo 4: </w:t>
-      </w:r>
-      <w:r>
-        <w:t xml:space="preserve">Cómo hacer ventas rápidas en mostrador en 3 segundos.
-</w:t>
-      </w:r>
-      <w:r>
-        <w:rPr>
-          <w:b/>
-          <w:bCs/>
-        </w:rPr>
-        <w:t xml:space="preserve">• Capítulo 5: </w:t>
-      </w:r>
-      <w:r>
-        <w:t xml:space="preserve">Cómo fiar de forma segura con pagaré y cupo máximo de crédito.
-</w:t>
-      </w:r>
-      <w:r>
-        <w:rPr>
-          <w:b/>
-          <w:bCs/>
-        </w:rPr>
-        <w:t xml:space="preserve">• Capítulo 6: </w:t>
-      </w:r>
-      <w:r>
-        <w:t xml:space="preserve">Cómo recibir abonos y enviar comprobantes por WhatsApp.
-</w:t>
-      </w:r>
-      <w:r>
-        <w:rPr>
-          <w:b/>
-          <w:bCs/>
-        </w:rPr>
-        <w:t xml:space="preserve">• Capítulo 7: </w:t>
-      </w:r>
-      <w:r>
+      <w:pPr>
+        <w:spacing w:after="80" w:before="40" w:line="260"/>
+        <w:ind w:left="360" w:hanging="240"/>
+      </w:pPr>
+      <w:r>
+        <w:rPr>
+          <w:b/>
+          <w:bCs/>
+          <w:color w:val="059669"/>
+        </w:rPr>
+        <w:t xml:space="preserve">•  </w:t>
+      </w:r>
+      <w:r>
+        <w:rPr>
+          <w:b/>
+          <w:bCs/>
+          <w:color w:val="0F172A"/>
+        </w:rPr>
+        <w:t xml:space="preserve">Capítulo 1: </w:t>
+      </w:r>
+      <w:r>
+        <w:rPr>
+          <w:color w:val="334155"/>
+        </w:rPr>
+        <w:t xml:space="preserve">Cómo subir tu logo y configurar tus cuentas de Nequi y Daviplata.</w:t>
+      </w:r>
+    </w:p>
+    <w:p>
+      <w:pPr>
+        <w:spacing w:after="80" w:before="40" w:line="260"/>
+        <w:ind w:left="360" w:hanging="240"/>
+      </w:pPr>
+      <w:r>
+        <w:rPr>
+          <w:b/>
+          <w:bCs/>
+          <w:color w:val="059669"/>
+        </w:rPr>
+        <w:t xml:space="preserve">•  </w:t>
+      </w:r>
+      <w:r>
+        <w:rPr>
+          <w:b/>
+          <w:bCs/>
+          <w:color w:val="0F172A"/>
+        </w:rPr>
+        <w:t xml:space="preserve">Capítulo 2: </w:t>
+      </w:r>
+      <w:r>
+        <w:rPr>
+          <w:color w:val="334155"/>
+        </w:rPr>
+        <w:t xml:space="preserve">Cómo abrir y cerrar tu caja todos los días sin descuadres.</w:t>
+      </w:r>
+    </w:p>
+    <w:p>
+      <w:pPr>
+        <w:spacing w:after="80" w:before="40" w:line="260"/>
+        <w:ind w:left="360" w:hanging="240"/>
+      </w:pPr>
+      <w:r>
+        <w:rPr>
+          <w:b/>
+          <w:bCs/>
+          <w:color w:val="059669"/>
+        </w:rPr>
+        <w:t xml:space="preserve">•  </w:t>
+      </w:r>
+      <w:r>
+        <w:rPr>
+          <w:b/>
+          <w:bCs/>
+          <w:color w:val="0F172A"/>
+        </w:rPr>
+        <w:t xml:space="preserve">Capítulo 3: </w:t>
+      </w:r>
+      <w:r>
+        <w:rPr>
+          <w:color w:val="334155"/>
+        </w:rPr>
+        <w:t xml:space="preserve">Cómo ingresar productos e imprimir etiquetas térmicas con Código QR o de barras.</w:t>
+      </w:r>
+    </w:p>
+    <w:p>
+      <w:pPr>
+        <w:spacing w:after="80" w:before="40" w:line="260"/>
+        <w:ind w:left="360" w:hanging="240"/>
+      </w:pPr>
+      <w:r>
+        <w:rPr>
+          <w:b/>
+          <w:bCs/>
+          <w:color w:val="059669"/>
+        </w:rPr>
+        <w:t xml:space="preserve">•  </w:t>
+      </w:r>
+      <w:r>
+        <w:rPr>
+          <w:b/>
+          <w:bCs/>
+          <w:color w:val="0F172A"/>
+        </w:rPr>
+        <w:t xml:space="preserve">Capítulo 4: </w:t>
+      </w:r>
+      <w:r>
+        <w:rPr>
+          <w:color w:val="334155"/>
+        </w:rPr>
+        <w:t xml:space="preserve">Cómo hacer ventas rápidas en mostrador en 3 segundos.</w:t>
+      </w:r>
+    </w:p>
+    <w:p>
+      <w:pPr>
+        <w:spacing w:after="80" w:before="40" w:line="260"/>
+        <w:ind w:left="360" w:hanging="240"/>
+      </w:pPr>
+      <w:r>
+        <w:rPr>
+          <w:b/>
+          <w:bCs/>
+          <w:color w:val="059669"/>
+        </w:rPr>
+        <w:t xml:space="preserve">•  </w:t>
+      </w:r>
+      <w:r>
+        <w:rPr>
+          <w:b/>
+          <w:bCs/>
+          <w:color w:val="0F172A"/>
+        </w:rPr>
+        <w:t xml:space="preserve">Capítulo 5: </w:t>
+      </w:r>
+      <w:r>
+        <w:rPr>
+          <w:color w:val="334155"/>
+        </w:rPr>
+        <w:t xml:space="preserve">Cómo fiar de forma segura con pagaré y cupo máximo de crédito.</w:t>
+      </w:r>
+    </w:p>
+    <w:p>
+      <w:pPr>
+        <w:spacing w:after="80" w:before="40" w:line="260"/>
+        <w:ind w:left="360" w:hanging="240"/>
+      </w:pPr>
+      <w:r>
+        <w:rPr>
+          <w:b/>
+          <w:bCs/>
+          <w:color w:val="059669"/>
+        </w:rPr>
+        <w:t xml:space="preserve">•  </w:t>
+      </w:r>
+      <w:r>
+        <w:rPr>
+          <w:b/>
+          <w:bCs/>
+          <w:color w:val="0F172A"/>
+        </w:rPr>
+        <w:t xml:space="preserve">Capítulo 6: </w:t>
+      </w:r>
+      <w:r>
+        <w:rPr>
+          <w:color w:val="334155"/>
+        </w:rPr>
+        <w:t xml:space="preserve">Cómo recibir abonos y enviar comprobantes por WhatsApp.</w:t>
+      </w:r>
+    </w:p>
+    <w:p>
+      <w:pPr>
+        <w:spacing w:after="80" w:before="40" w:line="260"/>
+        <w:ind w:left="360" w:hanging="240"/>
+      </w:pPr>
+      <w:r>
+        <w:rPr>
+          <w:b/>
+          <w:bCs/>
+          <w:color w:val="059669"/>
+        </w:rPr>
+        <w:t xml:space="preserve">•  </w:t>
+      </w:r>
+      <w:r>
+        <w:rPr>
+          <w:b/>
+          <w:bCs/>
+          <w:color w:val="0F172A"/>
+        </w:rPr>
+        <w:t xml:space="preserve">Capítulo 7: </w:t>
+      </w:r>
+      <w:r>
+        <w:rPr>
+          <w:color w:val="334155"/>
+        </w:rPr>
         <w:t xml:space="preserve">Cómo multiplicar tus ventas con el Plan Separe en temporadas altas.</w:t>
       </w:r>
     </w:p>

</xml_diff>

<commit_message>
docs(manual): capitulo 1 de usuario base en markdown
</commit_message>
<xml_diff>
--- a/docs/manual-usuario/word/00_Capitulo_Bienvenida_y_Mapa_del_Sistema.docx
+++ b/docs/manual-usuario/word/00_Capitulo_Bienvenida_y_Mapa_del_Sistema.docx
@@ -229,7 +229,7 @@
     </w:p>
     <w:p>
       <w:pPr>
-        <w:spacing w:after="120"/>
+        <w:spacing w:after="160"/>
       </w:pPr>
     </w:p>
     <w:p>
@@ -238,76 +238,219 @@
         <w:spacing w:after="120" w:before="280"/>
       </w:pPr>
       <w:r>
-        <w:t xml:space="preserve">2. Cómo tener Fiabono como App en tu Celular</w:t>
-      </w:r>
-    </w:p>
-    <w:p>
-      <w:pPr>
-        <w:spacing w:after="100"/>
-      </w:pPr>
-      <w:r>
-        <w:t xml:space="preserve">Fiabono no ocupa espacio en la memoria de tu teléfono ni se desactualiza. Puedes dejarlo en tu pantalla de inicio en pocos segundos:</w:t>
-      </w:r>
-    </w:p>
-    <w:p>
-      <w:pPr>
-        <w:spacing w:after="80" w:before="40" w:line="260"/>
-        <w:ind w:left="360" w:hanging="240"/>
-      </w:pPr>
-      <w:r>
-        <w:rPr>
-          <w:b/>
-          <w:bCs/>
-          <w:color w:val="059669"/>
-        </w:rPr>
-        <w:t xml:space="preserve">•  </w:t>
-      </w:r>
+        <w:t xml:space="preserve">2. Cómo Acceder e Instalar Fiabono en tus Dispositivos</w:t>
+      </w:r>
+    </w:p>
+    <w:p>
+      <w:pPr>
+        <w:spacing w:after="120"/>
+      </w:pPr>
+      <w:r>
+        <w:t xml:space="preserve">Fiabono funciona de forma sincronizada en la nube. Puedes tenerlo abierto en el computador de tu caja y al mismo tiempo en los celulares de tus vendedores. A continuación tienes el paso a paso exacto para cada dispositivo:</w:t>
+      </w:r>
+    </w:p>
+    <w:p>
+      <w:pPr>
+        <w:spacing w:after="80" w:before="100"/>
+      </w:pPr>
       <w:r>
         <w:rPr>
           <w:b/>
           <w:bCs/>
           <w:color w:val="0F172A"/>
-        </w:rPr>
-        <w:t xml:space="preserve">En Teléfonos Android (Google Chrome): </w:t>
-      </w:r>
-      <w:r>
-        <w:rPr>
-          <w:color w:val="334155"/>
-        </w:rPr>
-        <w:t xml:space="preserve">Abre fiabono.com &gt; Toca los tres puntos (⋮) arriba a la derecha &gt; Toca 'Agregar a la pantalla principal' o 'Instalar App'.</w:t>
-      </w:r>
-    </w:p>
-    <w:p>
-      <w:pPr>
-        <w:spacing w:after="80" w:before="40" w:line="260"/>
-        <w:ind w:left="360" w:hanging="240"/>
-      </w:pPr>
-      <w:r>
-        <w:rPr>
-          <w:b/>
-          <w:bCs/>
-          <w:color w:val="059669"/>
-        </w:rPr>
-        <w:t xml:space="preserve">•  </w:t>
-      </w:r>
-      <w:r>
-        <w:rPr>
-          <w:b/>
-          <w:bCs/>
-          <w:color w:val="0F172A"/>
-        </w:rPr>
-        <w:t xml:space="preserve">En Teléfonos iPhone (Safari): </w:t>
-      </w:r>
-      <w:r>
-        <w:rPr>
-          <w:color w:val="334155"/>
-        </w:rPr>
-        <w:t xml:space="preserve">Abre fiabono.com &gt; Toca el botón Compartir (cuadro con flecha arriba ↑) &gt; Toca 'Agregar al inicio'.</w:t>
-      </w:r>
-    </w:p>
-    <w:p>
-      <w:pPr>
-        <w:spacing w:after="80"/>
+          <w:sz w:val="24"/>
+          <w:szCs w:val="24"/>
+        </w:rPr>
+        <w:t xml:space="preserve">2.1. En Computadores de Escritorio y Portátiles (Windows y Mac)</w:t>
+      </w:r>
+    </w:p>
+    <w:tbl>
+      <w:tblPr>
+        <w:tblW w:type="pct" w:w="5000"/>
+        <w:tblBorders>
+          <w:top w:val="single" w:color="auto" w:sz="4"/>
+          <w:left w:val="single" w:color="auto" w:sz="4"/>
+          <w:bottom w:val="single" w:color="auto" w:sz="4"/>
+          <w:right w:val="single" w:color="auto" w:sz="4"/>
+          <w:insideH w:val="single" w:color="auto" w:sz="4"/>
+          <w:insideV w:val="single" w:color="auto" w:sz="4"/>
+        </w:tblBorders>
+      </w:tblPr>
+      <w:tblGrid>
+        <w:gridCol w:w="9506"/>
+      </w:tblGrid>
+      <w:tr>
+        <w:tc>
+          <w:tcPr>
+            <w:tcBorders>
+              <w:top w:val="single" w:color="CBD5E1" w:sz="1"/>
+              <w:left w:val="single" w:color="0284C7" w:sz="18"/>
+              <w:bottom w:val="single" w:color="CBD5E1" w:sz="1"/>
+              <w:right w:val="single" w:color="CBD5E1" w:sz="1"/>
+            </w:tcBorders>
+            <w:shd w:fill="F0F9FF" w:val="clear"/>
+          </w:tcPr>
+          <w:p>
+            <w:pPr>
+              <w:spacing w:after="100" w:before="100"/>
+            </w:pPr>
+            <w:r>
+              <w:rPr>
+                <w:b/>
+                <w:bCs/>
+                <w:color w:val="0F172A"/>
+                <w:sz w:val="22"/>
+                <w:szCs w:val="22"/>
+              </w:rPr>
+              <w:t xml:space="preserve">📋 Instalación como Programa de Escritorio en PC (Chrome / Edge)</w:t>
+            </w:r>
+          </w:p>
+          <w:p>
+            <w:pPr>
+              <w:spacing w:after="80" w:before="40" w:line="260"/>
+              <w:ind w:left="360" w:hanging="240"/>
+            </w:pPr>
+            <w:r>
+              <w:rPr>
+                <w:b/>
+                <w:bCs/>
+                <w:color w:val="0284C7"/>
+              </w:rPr>
+              <w:t xml:space="preserve">1. </w:t>
+            </w:r>
+            <w:r>
+              <w:rPr>
+                <w:b/>
+                <w:bCs/>
+                <w:color w:val="0F172A"/>
+              </w:rPr>
+              <w:t xml:space="preserve">Abre tu navegador: </w:t>
+            </w:r>
+            <w:r>
+              <w:rPr>
+                <w:color w:val="334155"/>
+              </w:rPr>
+              <w:t xml:space="preserve">Entra a Google Chrome o Microsoft Edge y escribe fiabono.com.</w:t>
+            </w:r>
+          </w:p>
+          <w:p>
+            <w:pPr>
+              <w:spacing w:after="80" w:before="40" w:line="260"/>
+              <w:ind w:left="360" w:hanging="240"/>
+            </w:pPr>
+            <w:r>
+              <w:rPr>
+                <w:b/>
+                <w:bCs/>
+                <w:color w:val="0284C7"/>
+              </w:rPr>
+              <w:t xml:space="preserve">2. </w:t>
+            </w:r>
+            <w:r>
+              <w:rPr>
+                <w:b/>
+                <w:bCs/>
+                <w:color w:val="0F172A"/>
+              </w:rPr>
+              <w:t xml:space="preserve">Inicia sesión: </w:t>
+            </w:r>
+            <w:r>
+              <w:rPr>
+                <w:color w:val="334155"/>
+              </w:rPr>
+              <w:t xml:space="preserve">Escribe tu correo y contraseña registrados.</w:t>
+            </w:r>
+          </w:p>
+          <w:p>
+            <w:pPr>
+              <w:spacing w:after="80" w:before="40" w:line="260"/>
+              <w:ind w:left="360" w:hanging="240"/>
+            </w:pPr>
+            <w:r>
+              <w:rPr>
+                <w:b/>
+                <w:bCs/>
+                <w:color w:val="0284C7"/>
+              </w:rPr>
+              <w:t xml:space="preserve">3. </w:t>
+            </w:r>
+            <w:r>
+              <w:rPr>
+                <w:b/>
+                <w:bCs/>
+                <w:color w:val="0F172A"/>
+              </w:rPr>
+              <w:t xml:space="preserve">Busca el icono de instalar: </w:t>
+            </w:r>
+            <w:r>
+              <w:rPr>
+                <w:color w:val="334155"/>
+              </w:rPr>
+              <w:t xml:space="preserve">Mira el extremo derecho de la barra donde escribes las páginas web (junto a la estrella). Verás un icono con un cuadro y una flechita: [ ⊕ Instalar Fiabono ].</w:t>
+            </w:r>
+          </w:p>
+          <w:p>
+            <w:pPr>
+              <w:spacing w:after="80" w:before="40" w:line="260"/>
+              <w:ind w:left="360" w:hanging="240"/>
+            </w:pPr>
+            <w:r>
+              <w:rPr>
+                <w:b/>
+                <w:bCs/>
+                <w:color w:val="0284C7"/>
+              </w:rPr>
+              <w:t xml:space="preserve">4. </w:t>
+            </w:r>
+            <w:r>
+              <w:rPr>
+                <w:b/>
+                <w:bCs/>
+                <w:color w:val="0F172A"/>
+              </w:rPr>
+              <w:t xml:space="preserve">Confirma la instalación: </w:t>
+            </w:r>
+            <w:r>
+              <w:rPr>
+                <w:color w:val="334155"/>
+              </w:rPr>
+              <w:t xml:space="preserve">Haz clic en [ Instalar ]. Se abrirá una ventana independiente limpia, sin barras de navegación.</w:t>
+            </w:r>
+          </w:p>
+          <w:p>
+            <w:pPr>
+              <w:spacing w:after="80" w:before="40" w:line="260"/>
+              <w:ind w:left="360" w:hanging="240"/>
+            </w:pPr>
+            <w:r>
+              <w:rPr>
+                <w:b/>
+                <w:bCs/>
+                <w:color w:val="0284C7"/>
+              </w:rPr>
+              <w:t xml:space="preserve">5. </w:t>
+            </w:r>
+            <w:r>
+              <w:rPr>
+                <w:b/>
+                <w:bCs/>
+                <w:color w:val="0F172A"/>
+              </w:rPr>
+              <w:t xml:space="preserve">Fíjalo en tu barra de tareas: </w:t>
+            </w:r>
+            <w:r>
+              <w:rPr>
+                <w:color w:val="334155"/>
+              </w:rPr>
+              <w:t xml:space="preserve">Haz clic derecho sobre el icono de Fiabono en la barra inferior de Windows y selecciona 'Anclar a la barra de tareas'. Así lo abrirás todos los días con 1 solo clic.</w:t>
+            </w:r>
+          </w:p>
+        </w:tc>
+      </w:tr>
+    </w:tbl>
+    <w:p>
+      <w:pPr>
+        <w:spacing w:after="60"/>
       </w:pPr>
     </w:p>
     <w:tbl>
@@ -330,11 +473,11 @@
           <w:tcPr>
             <w:tcBorders>
               <w:top w:val="none"/>
-              <w:left w:val="single" w:color="0D9488" w:sz="24"/>
+              <w:left w:val="single" w:color="0284C7" w:sz="24"/>
               <w:bottom w:val="none"/>
               <w:right w:val="none"/>
             </w:tcBorders>
-            <w:shd w:fill="F0FDFA" w:val="clear"/>
+            <w:shd w:fill="F0F9FF" w:val="clear"/>
           </w:tcPr>
           <w:p>
             <w:pPr>
@@ -344,11 +487,11 @@
               <w:rPr>
                 <w:b/>
                 <w:bCs/>
-                <w:color w:val="0D9488"/>
+                <w:color w:val="0284C7"/>
                 <w:sz w:val="22"/>
                 <w:szCs w:val="22"/>
               </w:rPr>
-              <w:t xml:space="preserve">💡 Consejo de Mostrador</w:t>
+              <w:t xml:space="preserve">💻 Truco de Mostrador: Pantalla Completa (Modo Kiosco)</w:t>
             </w:r>
           </w:p>
           <w:p>
@@ -361,7 +504,7 @@
                 <w:sz w:val="20"/>
                 <w:szCs w:val="20"/>
               </w:rPr>
-              <w:t xml:space="preserve">Al agregar el acceso directo en el celular de tus vendedores, el sistema se abrirá a pantalla completa como una aplicación nativa. No verán la barra de direcciones del navegador y atenderán mucho más rápido.</w:t>
+              <w:t xml:space="preserve">Cuando estés cobrando en tu computador, presiona la tecla F11 en tu teclado. Fiabono se expandirá por toda la pantalla de tu monitor, luciendo idéntico a una caja registradora profesional. Presiona F11 de nuevo para salir.</w:t>
             </w:r>
           </w:p>
         </w:tc>
@@ -374,6 +517,420 @@
     </w:p>
     <w:p>
       <w:pPr>
+        <w:spacing w:after="80" w:before="100"/>
+      </w:pPr>
+      <w:r>
+        <w:rPr>
+          <w:b/>
+          <w:bCs/>
+          <w:color w:val="0F172A"/>
+          <w:sz w:val="24"/>
+          <w:szCs w:val="24"/>
+        </w:rPr>
+        <w:t xml:space="preserve">2.2. En Teléfonos iPhone y Tablets iPad (Apple iOS)</w:t>
+      </w:r>
+    </w:p>
+    <w:tbl>
+      <w:tblPr>
+        <w:tblW w:type="pct" w:w="5000"/>
+        <w:tblBorders>
+          <w:top w:val="single" w:color="auto" w:sz="4"/>
+          <w:left w:val="single" w:color="auto" w:sz="4"/>
+          <w:bottom w:val="single" w:color="auto" w:sz="4"/>
+          <w:right w:val="single" w:color="auto" w:sz="4"/>
+          <w:insideH w:val="single" w:color="auto" w:sz="4"/>
+          <w:insideV w:val="single" w:color="auto" w:sz="4"/>
+        </w:tblBorders>
+      </w:tblPr>
+      <w:tblGrid>
+        <w:gridCol w:w="9506"/>
+      </w:tblGrid>
+      <w:tr>
+        <w:tc>
+          <w:tcPr>
+            <w:tcBorders>
+              <w:top w:val="single" w:color="CBD5E1" w:sz="1"/>
+              <w:left w:val="single" w:color="059669" w:sz="18"/>
+              <w:bottom w:val="single" w:color="CBD5E1" w:sz="1"/>
+              <w:right w:val="single" w:color="CBD5E1" w:sz="1"/>
+            </w:tcBorders>
+            <w:shd w:fill="F0FDF4" w:val="clear"/>
+          </w:tcPr>
+          <w:p>
+            <w:pPr>
+              <w:spacing w:after="100" w:before="100"/>
+            </w:pPr>
+            <w:r>
+              <w:rPr>
+                <w:b/>
+                <w:bCs/>
+                <w:color w:val="0F172A"/>
+                <w:sz w:val="22"/>
+                <w:szCs w:val="22"/>
+              </w:rPr>
+              <w:t xml:space="preserve">📋 Instalación en iPhone / iPad con Safari (Paso a Paso)</w:t>
+            </w:r>
+          </w:p>
+          <w:p>
+            <w:pPr>
+              <w:spacing w:after="80" w:before="40" w:line="260"/>
+              <w:ind w:left="360" w:hanging="240"/>
+            </w:pPr>
+            <w:r>
+              <w:rPr>
+                <w:b/>
+                <w:bCs/>
+                <w:color w:val="059669"/>
+              </w:rPr>
+              <w:t xml:space="preserve">1. </w:t>
+            </w:r>
+            <w:r>
+              <w:rPr>
+                <w:b/>
+                <w:bCs/>
+                <w:color w:val="0F172A"/>
+              </w:rPr>
+              <w:t xml:space="preserve">Abre SAFARI (Muy Importante): </w:t>
+            </w:r>
+            <w:r>
+              <w:rPr>
+                <w:color w:val="334155"/>
+              </w:rPr>
+              <w:t xml:space="preserve">En iPhone debes usar el navegador Safari (el icono de la brújula azul). Apple no permite agregar a pantalla de inicio desde Chrome.</w:t>
+            </w:r>
+          </w:p>
+          <w:p>
+            <w:pPr>
+              <w:spacing w:after="80" w:before="40" w:line="260"/>
+              <w:ind w:left="360" w:hanging="240"/>
+            </w:pPr>
+            <w:r>
+              <w:rPr>
+                <w:b/>
+                <w:bCs/>
+                <w:color w:val="059669"/>
+              </w:rPr>
+              <w:t xml:space="preserve">2. </w:t>
+            </w:r>
+            <w:r>
+              <w:rPr>
+                <w:b/>
+                <w:bCs/>
+                <w:color w:val="0F172A"/>
+              </w:rPr>
+              <w:t xml:space="preserve">Ingresa a la página: </w:t>
+            </w:r>
+            <w:r>
+              <w:rPr>
+                <w:color w:val="334155"/>
+              </w:rPr>
+              <w:t xml:space="preserve">Escribe fiabono.com e inicia sesión con tu cuenta.</w:t>
+            </w:r>
+          </w:p>
+          <w:p>
+            <w:pPr>
+              <w:spacing w:after="80" w:before="40" w:line="260"/>
+              <w:ind w:left="360" w:hanging="240"/>
+            </w:pPr>
+            <w:r>
+              <w:rPr>
+                <w:b/>
+                <w:bCs/>
+                <w:color w:val="059669"/>
+              </w:rPr>
+              <w:t xml:space="preserve">3. </w:t>
+            </w:r>
+            <w:r>
+              <w:rPr>
+                <w:b/>
+                <w:bCs/>
+                <w:color w:val="0F172A"/>
+              </w:rPr>
+              <w:t xml:space="preserve">Toca el botón Compartir: </w:t>
+            </w:r>
+            <w:r>
+              <w:rPr>
+                <w:color w:val="334155"/>
+              </w:rPr>
+              <w:t xml:space="preserve">En la parte inferior de la pantalla de tu iPhone, toca el cuadro con una flecha que apunta hacia arriba ( ↑ ).</w:t>
+            </w:r>
+          </w:p>
+          <w:p>
+            <w:pPr>
+              <w:spacing w:after="80" w:before="40" w:line="260"/>
+              <w:ind w:left="360" w:hanging="240"/>
+            </w:pPr>
+            <w:r>
+              <w:rPr>
+                <w:b/>
+                <w:bCs/>
+                <w:color w:val="059669"/>
+              </w:rPr>
+              <w:t xml:space="preserve">4. </w:t>
+            </w:r>
+            <w:r>
+              <w:rPr>
+                <w:b/>
+                <w:bCs/>
+                <w:color w:val="0F172A"/>
+              </w:rPr>
+              <w:t xml:space="preserve">Selecciona 'Agregar al inicio': </w:t>
+            </w:r>
+            <w:r>
+              <w:rPr>
+                <w:color w:val="334155"/>
+              </w:rPr>
+              <w:t xml:space="preserve">En el menú blanco que se despliega, desliza el dedo hacia abajo hasta encontrar la opción [ ➕ Agregar al inicio ] (Add to Home Screen).</w:t>
+            </w:r>
+          </w:p>
+          <w:p>
+            <w:pPr>
+              <w:spacing w:after="80" w:before="40" w:line="260"/>
+              <w:ind w:left="360" w:hanging="240"/>
+            </w:pPr>
+            <w:r>
+              <w:rPr>
+                <w:b/>
+                <w:bCs/>
+                <w:color w:val="059669"/>
+              </w:rPr>
+              <w:t xml:space="preserve">5. </w:t>
+            </w:r>
+            <w:r>
+              <w:rPr>
+                <w:b/>
+                <w:bCs/>
+                <w:color w:val="0F172A"/>
+              </w:rPr>
+              <w:t xml:space="preserve">Confirma el icono: </w:t>
+            </w:r>
+            <w:r>
+              <w:rPr>
+                <w:color w:val="334155"/>
+              </w:rPr>
+              <w:t xml:space="preserve">Verás el logo verde de Fiabono. Toca 'Agregar' en la esquina superior derecha.</w:t>
+            </w:r>
+          </w:p>
+          <w:p>
+            <w:pPr>
+              <w:spacing w:after="80" w:before="40" w:line="260"/>
+              <w:ind w:left="360" w:hanging="240"/>
+            </w:pPr>
+            <w:r>
+              <w:rPr>
+                <w:b/>
+                <w:bCs/>
+                <w:color w:val="059669"/>
+              </w:rPr>
+              <w:t xml:space="preserve">6. </w:t>
+            </w:r>
+            <w:r>
+              <w:rPr>
+                <w:b/>
+                <w:bCs/>
+                <w:color w:val="0F172A"/>
+              </w:rPr>
+              <w:t xml:space="preserve">¡Listo!: </w:t>
+            </w:r>
+            <w:r>
+              <w:rPr>
+                <w:color w:val="334155"/>
+              </w:rPr>
+              <w:t xml:space="preserve">El icono de Fiabono quedará en tu pantalla junto a WhatsApp. Al tocarlo abre en pantalla completa sin las barras de Safari.</w:t>
+            </w:r>
+          </w:p>
+        </w:tc>
+      </w:tr>
+    </w:tbl>
+    <w:p>
+      <w:pPr>
+        <w:spacing w:after="140"/>
+      </w:pPr>
+    </w:p>
+    <w:p>
+      <w:pPr>
+        <w:spacing w:after="80" w:before="100"/>
+      </w:pPr>
+      <w:r>
+        <w:rPr>
+          <w:b/>
+          <w:bCs/>
+          <w:color w:val="0F172A"/>
+          <w:sz w:val="24"/>
+          <w:szCs w:val="24"/>
+        </w:rPr>
+        <w:t xml:space="preserve">2.3. En Teléfonos y Tablets Android (Samsung, Xiaomi, Motorola, etc.)</w:t>
+      </w:r>
+    </w:p>
+    <w:tbl>
+      <w:tblPr>
+        <w:tblW w:type="pct" w:w="5000"/>
+        <w:tblBorders>
+          <w:top w:val="single" w:color="auto" w:sz="4"/>
+          <w:left w:val="single" w:color="auto" w:sz="4"/>
+          <w:bottom w:val="single" w:color="auto" w:sz="4"/>
+          <w:right w:val="single" w:color="auto" w:sz="4"/>
+          <w:insideH w:val="single" w:color="auto" w:sz="4"/>
+          <w:insideV w:val="single" w:color="auto" w:sz="4"/>
+        </w:tblBorders>
+      </w:tblPr>
+      <w:tblGrid>
+        <w:gridCol w:w="9506"/>
+      </w:tblGrid>
+      <w:tr>
+        <w:tc>
+          <w:tcPr>
+            <w:tcBorders>
+              <w:top w:val="single" w:color="CBD5E1" w:sz="1"/>
+              <w:left w:val="single" w:color="D97706" w:sz="18"/>
+              <w:bottom w:val="single" w:color="CBD5E1" w:sz="1"/>
+              <w:right w:val="single" w:color="CBD5E1" w:sz="1"/>
+            </w:tcBorders>
+            <w:shd w:fill="FFFBEB" w:val="clear"/>
+          </w:tcPr>
+          <w:p>
+            <w:pPr>
+              <w:spacing w:after="100" w:before="100"/>
+            </w:pPr>
+            <w:r>
+              <w:rPr>
+                <w:b/>
+                <w:bCs/>
+                <w:color w:val="0F172A"/>
+                <w:sz w:val="22"/>
+                <w:szCs w:val="22"/>
+              </w:rPr>
+              <w:t xml:space="preserve">📋 Instalación Rápida en Celulares Android (Google Chrome)</w:t>
+            </w:r>
+          </w:p>
+          <w:p>
+            <w:pPr>
+              <w:spacing w:after="80" w:before="40" w:line="260"/>
+              <w:ind w:left="360" w:hanging="240"/>
+            </w:pPr>
+            <w:r>
+              <w:rPr>
+                <w:b/>
+                <w:bCs/>
+                <w:color w:val="D97706"/>
+              </w:rPr>
+              <w:t xml:space="preserve">1. </w:t>
+            </w:r>
+            <w:r>
+              <w:rPr>
+                <w:b/>
+                <w:bCs/>
+                <w:color w:val="0F172A"/>
+              </w:rPr>
+              <w:t xml:space="preserve">Método Rápido: </w:t>
+            </w:r>
+            <w:r>
+              <w:rPr>
+                <w:color w:val="334155"/>
+              </w:rPr>
+              <w:t xml:space="preserve">Abre fiabono.com en Chrome. Verás un mensaje automático abajo que dice '¿Deseas agregar Fiabono a tu pantalla principal?'. Toca [ Instalar ].</w:t>
+            </w:r>
+          </w:p>
+          <w:p>
+            <w:pPr>
+              <w:spacing w:after="80" w:before="40" w:line="260"/>
+              <w:ind w:left="360" w:hanging="240"/>
+            </w:pPr>
+            <w:r>
+              <w:rPr>
+                <w:b/>
+                <w:bCs/>
+                <w:color w:val="D97706"/>
+              </w:rPr>
+              <w:t xml:space="preserve">2. </w:t>
+            </w:r>
+            <w:r>
+              <w:rPr>
+                <w:b/>
+                <w:bCs/>
+                <w:color w:val="0F172A"/>
+              </w:rPr>
+              <w:t xml:space="preserve">Método Manual: </w:t>
+            </w:r>
+            <w:r>
+              <w:rPr>
+                <w:color w:val="334155"/>
+              </w:rPr>
+              <w:t xml:space="preserve">Si no viste el mensaje, toca los tres puntos (⋮) arriba a la derecha en Chrome y selecciona 'Instalar aplicación' o 'Agregar a la pantalla principal'.</w:t>
+            </w:r>
+          </w:p>
+        </w:tc>
+      </w:tr>
+    </w:tbl>
+    <w:p>
+      <w:pPr>
+        <w:spacing w:after="80"/>
+      </w:pPr>
+    </w:p>
+    <w:tbl>
+      <w:tblPr>
+        <w:tblW w:type="pct" w:w="5000"/>
+        <w:tblBorders>
+          <w:top w:val="single" w:color="auto" w:sz="4"/>
+          <w:left w:val="single" w:color="auto" w:sz="4"/>
+          <w:bottom w:val="single" w:color="auto" w:sz="4"/>
+          <w:right w:val="single" w:color="auto" w:sz="4"/>
+          <w:insideH w:val="single" w:color="auto" w:sz="4"/>
+          <w:insideV w:val="single" w:color="auto" w:sz="4"/>
+        </w:tblBorders>
+      </w:tblPr>
+      <w:tblGrid>
+        <w:gridCol w:w="9506"/>
+      </w:tblGrid>
+      <w:tr>
+        <w:tc>
+          <w:tcPr>
+            <w:tcBorders>
+              <w:top w:val="none"/>
+              <w:left w:val="single" w:color="059669" w:sz="24"/>
+              <w:bottom w:val="none"/>
+              <w:right w:val="none"/>
+            </w:tcBorders>
+            <w:shd w:fill="F0FDF4" w:val="clear"/>
+          </w:tcPr>
+          <w:p>
+            <w:pPr>
+              <w:spacing w:after="60" w:before="100"/>
+            </w:pPr>
+            <w:r>
+              <w:rPr>
+                <w:b/>
+                <w:bCs/>
+                <w:color w:val="059669"/>
+                <w:sz w:val="22"/>
+                <w:szCs w:val="22"/>
+              </w:rPr>
+              <w:t xml:space="preserve">⚡ ¿Por qué es mejor que descargar de una tienda tradicional?</w:t>
+            </w:r>
+          </w:p>
+          <w:p>
+            <w:pPr>
+              <w:spacing w:after="100"/>
+            </w:pPr>
+            <w:r>
+              <w:rPr>
+                <w:color w:val="334155"/>
+                <w:sz w:val="20"/>
+                <w:szCs w:val="20"/>
+              </w:rPr>
+              <w:t xml:space="preserve">Fiabono no ocupa espacio en la memoria del celular de tus empleados (0 Megabytes de descargas pesadas). Además, cada vez que agregamos una mejora, la recibes al instante sin tener que esperar días a que la tienda apruebe actualizaciones.</w:t>
+            </w:r>
+          </w:p>
+        </w:tc>
+      </w:tr>
+    </w:tbl>
+    <w:p>
+      <w:pPr>
+        <w:spacing w:after="160"/>
+      </w:pPr>
+    </w:p>
+    <w:p>
+      <w:pPr>
         <w:pStyle w:val="Heading1"/>
         <w:spacing w:after="120" w:before="280"/>
       </w:pPr>
@@ -386,7 +943,7 @@
         <w:spacing w:after="100"/>
       </w:pPr>
       <w:r>
-        <w:t xml:space="preserve">La interfaz de Fiabono está diseñada para que puedas manejar todo el negocio con una sola mano desde tu celular:</w:t>
+        <w:t xml:space="preserve">La interfaz de Fiabono está organizada para que puedas manejar todo el local con una sola mano desde tu celular o con la máxima amplitud en tu computador:</w:t>
       </w:r>
     </w:p>
     <w:p>
@@ -463,7 +1020,7 @@
           <w:sz w:val="24"/>
           <w:szCs w:val="24"/>
         </w:rPr>
-        <w:t xml:space="preserve">El Menú Inferior (Dock Flotante Táctil):</w:t>
+        <w:t xml:space="preserve">El Menú Inferior (Dock Flotante Táctil en Celulares):</w:t>
       </w:r>
     </w:p>
     <w:p>

</xml_diff>